<commit_message>
Lab 6: add notes.md, fix title page
</commit_message>
<xml_diff>
--- a/lab6/Raport_Lab6_SO.docx
+++ b/lab6/Raport_Lab6_SO.docx
@@ -237,7 +237,7 @@
           <w:b/>
           <w:bCs/>
         </w:rPr>
-        <w:t xml:space="preserve">Dulgheru Ion, grupa 241</w:t>
+        <w:t xml:space="preserve">Done by: st. gr. FAF-241, Dulgheru Ion</w:t>
       </w:r>
       <w:r/>
     </w:p>
@@ -425,7 +425,7 @@
         <w:rPr/>
       </w:pPr>
       <w:r>
-        <w:t xml:space="preserve">Verificat de: Reitman Patricia</w:t>
+        <w:t xml:space="preserve">Checked by: Reitman Patricia</w:t>
       </w:r>
       <w:r/>
     </w:p>

</xml_diff>